<commit_message>
door_pipeline/partno + door_partno: 미확정 3세션 정리(1프레임 세션 2건 확정, 빈 지그 무효화) — 블라인드 35/35 재채점, radar_check --set(CLI 확정)
- radar_check.py --set <session_dir> 1|0|clear: 외부망 등 웹 /options 접근 불가 시 명령줄 확정
- 9/5 s_123451 레이더 X·9/22 s_080559 레이더 O 확정(사용자 육안), 8/27 s_122816 빈 지그 invalidate → 확정 세션 147(레이더 52·없음 95), 뷰 3,780장
- 블라인드 35세션 663장: 규칙 100%(판정 99.8%), 35세션 제외 학습 검출기 100%(판정 97.1%), CNN 90.3~95.2%; evaluate_partno 전량 185세션 판정 183·100%; 명세서·리포트 갱신

Co-Authored-By: Claude Fable 5.1 <noreply@anthropic.com>
</commit_message>
<xml_diff>
--- a/class_estimation/door_pipeline/DOC_dataset_spec.docx
+++ b/class_estimation/door_pipeline/DOC_dataset_spec.docx
@@ -125,7 +125,7 @@
         <w:t>규모</w:t>
       </w:r>
       <w:r>
-        <w:t>: 유효 세션 191 · NAS 수집 쌍 18,123 · 로컬 샘플 3,789장 (기간 20260827~20260923, 무인 수집 정식 설치 2026-08-27). 무효 세션 6(시험 촬영·빈 지그), 라벨 미정 4, 라벨 정정 세션 10.</w:t>
+        <w:t>: 유효 세션 192 · NAS 수집 쌍 18,303 · 로컬 샘플 3,780장 (기간 20260827~20260923, 무인 수집 정식 설치 2026-08-27). 무효 세션 7(시험 촬영·빈 지그), 라벨 미정 4, 라벨 정정 세션 10.</w:t>
       </w:r>
     </w:p>
     <w:p>
@@ -3518,7 +3518,7 @@
                 <w:b w:val="0"/>
                 <w:sz w:val="16"/>
               </w:rPr>
-              <w:t>20</w:t>
+              <w:t>19</w:t>
             </w:r>
           </w:p>
         </w:tc>
@@ -3532,7 +3532,7 @@
                 <w:b w:val="0"/>
                 <w:sz w:val="16"/>
               </w:rPr>
-              <w:t>1,919</w:t>
+              <w:t>1,910</w:t>
             </w:r>
           </w:p>
         </w:tc>
@@ -3546,7 +3546,7 @@
                 <w:b w:val="0"/>
                 <w:sz w:val="16"/>
               </w:rPr>
-              <w:t>401</w:t>
+              <w:t>392</w:t>
             </w:r>
           </w:p>
         </w:tc>
@@ -3560,7 +3560,7 @@
                 <w:b w:val="0"/>
                 <w:sz w:val="16"/>
               </w:rPr>
-              <w:t>20260827~20260922</w:t>
+              <w:t>20260828~20260922</w:t>
             </w:r>
           </w:p>
         </w:tc>
@@ -3574,7 +3574,7 @@
                 <w:b w:val="0"/>
                 <w:sz w:val="16"/>
               </w:rPr>
-              <w:t>3/3/11 (+미지정 3)</w:t>
+              <w:t>3/2/11 (+미지정 3)</w:t>
             </w:r>
           </w:p>
         </w:tc>
@@ -3618,7 +3618,7 @@
                 <w:b w:val="0"/>
                 <w:sz w:val="16"/>
               </w:rPr>
-              <w:t>15</w:t>
+              <w:t>16</w:t>
             </w:r>
           </w:p>
         </w:tc>
@@ -3632,7 +3632,7 @@
                 <w:b w:val="0"/>
                 <w:sz w:val="16"/>
               </w:rPr>
-              <w:t>1,517</w:t>
+              <w:t>1,570</w:t>
             </w:r>
           </w:p>
         </w:tc>
@@ -3660,7 +3660,7 @@
                 <w:b w:val="0"/>
                 <w:sz w:val="16"/>
               </w:rPr>
-              <w:t>20260831~20260922</w:t>
+              <w:t>20260831~20260923</w:t>
             </w:r>
           </w:p>
         </w:tc>
@@ -3718,7 +3718,7 @@
                 <w:b w:val="0"/>
                 <w:sz w:val="16"/>
               </w:rPr>
-              <w:t>19</w:t>
+              <w:t>20</w:t>
             </w:r>
           </w:p>
         </w:tc>
@@ -3732,7 +3732,7 @@
                 <w:b w:val="0"/>
                 <w:sz w:val="16"/>
               </w:rPr>
-              <w:t>1,481</w:t>
+              <w:t>1,617</w:t>
             </w:r>
           </w:p>
         </w:tc>
@@ -3760,7 +3760,7 @@
                 <w:b w:val="0"/>
                 <w:sz w:val="16"/>
               </w:rPr>
-              <w:t>20260828~20260922</w:t>
+              <w:t>20260828~20260923</w:t>
             </w:r>
           </w:p>
         </w:tc>
@@ -3818,7 +3818,7 @@
                 <w:b/>
                 <w:sz w:val="16"/>
               </w:rPr>
-              <w:t>191</w:t>
+              <w:t>192</w:t>
             </w:r>
           </w:p>
         </w:tc>
@@ -3832,7 +3832,7 @@
                 <w:b/>
                 <w:sz w:val="16"/>
               </w:rPr>
-              <w:t>18,123</w:t>
+              <w:t>18,303</w:t>
             </w:r>
           </w:p>
         </w:tc>
@@ -3846,7 +3846,7 @@
                 <w:b/>
                 <w:sz w:val="16"/>
               </w:rPr>
-              <w:t>3,789</w:t>
+              <w:t>3,780</w:t>
             </w:r>
           </w:p>
         </w:tc>
@@ -4431,7 +4431,7 @@
                 <w:b w:val="0"/>
                 <w:sz w:val="16"/>
               </w:rPr>
-              <w:t>31</w:t>
+              <w:t>32</w:t>
             </w:r>
           </w:p>
         </w:tc>
@@ -4501,7 +4501,7 @@
                 <w:b w:val="0"/>
                 <w:sz w:val="16"/>
               </w:rPr>
-              <w:t>2</w:t>
+              <w:t>1</w:t>
             </w:r>
           </w:p>
         </w:tc>
@@ -4689,7 +4689,7 @@
                 <w:b w:val="0"/>
                 <w:sz w:val="16"/>
               </w:rPr>
-              <w:t>1</w:t>
+              <w:t>0</w:t>
             </w:r>
           </w:p>
         </w:tc>
@@ -4763,7 +4763,7 @@
                 <w:b w:val="0"/>
                 <w:sz w:val="16"/>
               </w:rPr>
-              <w:t>15</w:t>
+              <w:t>16</w:t>
             </w:r>
           </w:p>
         </w:tc>
@@ -4849,7 +4849,7 @@
                 <w:b w:val="0"/>
                 <w:sz w:val="16"/>
               </w:rPr>
-              <w:t>9</w:t>
+              <w:t>10</w:t>
             </w:r>
           </w:p>
         </w:tc>
@@ -5916,7 +5916,7 @@
         <w:pStyle w:val="ListBullet"/>
       </w:pPr>
       <w:r>
-        <w:t>품번 세션 단위 · 전량: 대상 186(GT 확정 183, 미확정 3) · 판정률 100.0% · 판정 정확도 100.0% (183/183).</w:t>
+        <w:t>품번 세션 단위 · 전량: 대상 185(GT 확정 185, 미확정 0) · 판정률 98.9% · 판정 정확도 100.0% (183/183).</w:t>
       </w:r>
     </w:p>
     <w:p>

</xml_diff>